<commit_message>
docs: second pitch pass (signals/OB-only framing, no em-dashes); rename OBCO->WCO, OB_Vend->LCO repo-wide
</commit_message>
<xml_diff>
--- a/Board pitch/Owned_Brands_Board_Brief.docx
+++ b/Board pitch/Owned_Brands_Board_Brief.docx
@@ -48,7 +48,7 @@
           <w:sz w:val="16"/>
           <w:szCs w:val="16"/>
         </w:rPr>
-        <w:t xml:space="preserve">Jeff Goodman — Director, Sales, Owned Brands   ·   June 19, 2026   ·   Status: Discovery / prototype</w:t>
+        <w:t xml:space="preserve">Jeff Goodman   ·   Director, Sales, Owned Brands   ·   June 19, 2026   ·   Status: Discovery / prototype</w:t>
       </w:r>
     </w:p>
     <w:p>
@@ -73,7 +73,7 @@
     </w:p>
     <w:p>
       <w:pPr>
-        <w:spacing w:after="40" w:before="160"/>
+        <w:spacing w:after="40" w:before="150"/>
       </w:pPr>
       <w:r>
         <w:rPr>
@@ -85,7 +85,7 @@
           <w:sz w:val="17"/>
           <w:szCs w:val="17"/>
         </w:rPr>
-        <w:t xml:space="preserve">WHO WE ARE — AND WHAT’S MISSING</w:t>
+        <w:t xml:space="preserve">WHO WE ARE, AND WHAT’S MISSING</w:t>
       </w:r>
     </w:p>
     <w:p>
@@ -121,7 +121,7 @@
           <w:sz w:val="18"/>
           <w:szCs w:val="18"/>
         </w:rPr>
-        <w:t xml:space="preserve"> team — our job is to call on WCO sellers and select WCO customers and help them win.</w:t>
+        <w:t xml:space="preserve"> team. Our job is to call on WCO sellers and select WCO customers and help them win.</w:t>
       </w:r>
     </w:p>
     <w:p>
@@ -139,7 +139,7 @@
           <w:sz w:val="18"/>
           <w:szCs w:val="18"/>
         </w:rPr>
-        <w:t xml:space="preserve">We don’t get the signals: which sellers are about to lose a deal they could win, or where competitive pressure and missing national-brand support are eroding margin.</w:t>
+        <w:t xml:space="preserve">Stronger signals would put us in the right place at the right time: which sellers are about to lose a deal they could win, and where competitive pressure or missing national-brand support is eroding margin.</w:t>
       </w:r>
     </w:p>
     <w:p>
@@ -157,12 +157,12 @@
           <w:sz w:val="18"/>
           <w:szCs w:val="18"/>
         </w:rPr>
-        <w:t xml:space="preserve">WCO’s systems (CORE, USD) are built for the distributor, not the vendor lens — so the work lives in disconnected spreadsheets.</w:t>
-      </w:r>
-    </w:p>
-    <w:p>
-      <w:pPr>
-        <w:spacing w:after="40" w:before="160"/>
+        <w:t xml:space="preserve">WCO’s systems (CORE, USD) are built for the distributor, not the vendor lens. Tools built specifically for OB will lift win rate and margin organization-wide.</w:t>
+      </w:r>
+    </w:p>
+    <w:p>
+      <w:pPr>
+        <w:spacing w:after="40" w:before="150"/>
       </w:pPr>
       <w:r>
         <w:rPr>
@@ -192,12 +192,12 @@
           <w:sz w:val="18"/>
           <w:szCs w:val="18"/>
         </w:rPr>
-        <w:t xml:space="preserve">A read-only, vendor-side intelligence and activity platform inside WCO — it surfaces the signals and tracks our engagement, so we show up at the right time with the right pitch.</w:t>
-      </w:r>
-    </w:p>
-    <w:p>
-      <w:pPr>
-        <w:spacing w:after="40" w:before="160"/>
+        <w:t xml:space="preserve">A read-only, vendor-side intelligence and activity platform inside WCO. It surfaces the signals and tracks our engagement, so we show up at the right time with the right pitch.</w:t>
+      </w:r>
+    </w:p>
+    <w:p>
+      <w:pPr>
+        <w:spacing w:after="40" w:before="150"/>
       </w:pPr>
       <w:r>
         <w:rPr>
@@ -209,7 +209,7 @@
           <w:sz w:val="17"/>
           <w:szCs w:val="17"/>
         </w:rPr>
-        <w:t xml:space="preserve">THE VALUE LOOP — OUR NORTH STAR</w:t>
+        <w:t xml:space="preserve">THE VALUE LOOP, OUR NORTH STAR</w:t>
       </w:r>
     </w:p>
     <w:p>
@@ -289,12 +289,12 @@
           <w:sz w:val="18"/>
           <w:szCs w:val="18"/>
         </w:rPr>
-        <w:t xml:space="preserve">owned brands grow</w:t>
-      </w:r>
-    </w:p>
-    <w:p>
-      <w:pPr>
-        <w:spacing w:after="40" w:before="160"/>
+        <w:t xml:space="preserve">growth</w:t>
+      </w:r>
+    </w:p>
+    <w:p>
+      <w:pPr>
+        <w:spacing w:after="40" w:before="150"/>
       </w:pPr>
       <w:r>
         <w:rPr>
@@ -324,7 +324,7 @@
           <w:sz w:val="18"/>
           <w:szCs w:val="18"/>
         </w:rPr>
-        <w:t xml:space="preserve">Competitive product cross database — competitor part → owned-brand equivalent, living and searchable.</w:t>
+        <w:t xml:space="preserve">Competitive product cross database: competitor part → owned-brand equivalent, living and searchable. Built for OB sales-team enablement, not org-wide access.</w:t>
       </w:r>
     </w:p>
     <w:p>
@@ -342,7 +342,7 @@
           <w:sz w:val="18"/>
           <w:szCs w:val="18"/>
         </w:rPr>
-        <w:t xml:space="preserve">Signals that rank where to show up — deals at risk, margin under pressure, conversion openings.</w:t>
+        <w:t xml:space="preserve">Signals that rank where to show up: deals at risk, margin under pressure, conversion openings.</w:t>
       </w:r>
     </w:p>
     <w:p>
@@ -360,7 +360,7 @@
           <w:sz w:val="18"/>
           <w:szCs w:val="18"/>
         </w:rPr>
-        <w:t xml:space="preserve">Vendor-lens CRM — opportunities, quotes, calls, visits, demos: our engagement with WCO sellers and customers.</w:t>
+        <w:t xml:space="preserve">Vendor-lens CRM: OB-generated opportunities, quotes, calls, visits, demos. The WCO seller is our customer, and engagement with a WCO seller isn’t tracked in USD.</w:t>
       </w:r>
     </w:p>
     <w:p>
@@ -378,7 +378,7 @@
           <w:sz w:val="18"/>
           <w:szCs w:val="18"/>
         </w:rPr>
-        <w:t xml:space="preserve">AI email-drop (a note → structured records), datasheet cross-extraction, and a natural-language leadership dashboard.</w:t>
+        <w:t xml:space="preserve">AI email-drop (a note → structured records), datasheet cross-extraction, opportunity-loss tracking, product-development signals, and a natural-language leadership dashboard.</w:t>
       </w:r>
     </w:p>
     <w:p>
@@ -401,7 +401,7 @@
     </w:p>
     <w:p>
       <w:pPr>
-        <w:spacing w:after="40" w:before="160"/>
+        <w:spacing w:after="40" w:before="150"/>
       </w:pPr>
       <w:r>
         <w:rPr>
@@ -431,7 +431,7 @@
           <w:sz w:val="18"/>
           <w:szCs w:val="18"/>
         </w:rPr>
-        <w:t xml:space="preserve">Read-only toward CORE and USD — no writes, no data duplication, no egress.</w:t>
+        <w:t xml:space="preserve">Read-only toward CORE and USD: no writes, no data duplication, no egress.</w:t>
       </w:r>
     </w:p>
     <w:p>
@@ -455,7 +455,7 @@
     <w:p>
       <w:pPr>
         <w:shd w:fill="1B7F4B" w:val="clear"/>
-        <w:spacing w:after="0" w:before="150"/>
+        <w:spacing w:after="0" w:before="130"/>
       </w:pPr>
       <w:r>
         <w:rPr>
@@ -475,7 +475,7 @@
           <w:sz w:val="18"/>
           <w:szCs w:val="18"/>
         </w:rPr>
-        <w:t xml:space="preserve">Approve read-only access to governed WCO sales data (incl. margin/cost) for the Owned Brands sales team, provision the Azure build environment, and assign governance liaisons. Tooling and budget detail overleaf.</w:t>
+        <w:t xml:space="preserve">Approve read-only access to governed WCO sales data (incl. margin/cost) for the Owned Brands sales team only, with no access outside OB. Provision the Azure build environment and assign governance liaisons. Tooling and budget detail overleaf.</w:t>
       </w:r>
     </w:p>
     <w:p>
@@ -512,7 +512,7 @@
           <w:sz w:val="22"/>
           <w:szCs w:val="22"/>
         </w:rPr>
-        <w:t xml:space="preserve">Owned Brands Sales Intelligence Platform — the case in one page</w:t>
+        <w:t xml:space="preserve">Owned Brands Sales Intelligence Platform: the case in one page</w:t>
       </w:r>
     </w:p>
     <w:p>
@@ -520,7 +520,7 @@
         <w:pBdr>
           <w:bottom w:val="single" w:color="D9D9D9" w:sz="4" w:space="2"/>
         </w:pBdr>
-        <w:spacing w:after="24" w:before="92"/>
+        <w:spacing w:after="22" w:before="88"/>
       </w:pPr>
       <w:r>
         <w:rPr>
@@ -557,7 +557,7 @@
           <w:sz w:val="18"/>
           <w:szCs w:val="18"/>
         </w:rPr>
-        <w:t xml:space="preserve">We are WCO’s owned-brands vendor team, and our job is to call on WCO sellers and WCO customers. The better our data, the better we identify the signals that put us in the right place at the right time.</w:t>
+        <w:t xml:space="preserve">We are WCO’s owned-brands vendor team, and our job is to call on WCO sellers and WCO customers. The better our data, the better we identify the signals that put us in the right place at the right time, and the more we lift win rate and margin organization-wide.</w:t>
       </w:r>
     </w:p>
     <w:p>
@@ -565,7 +565,7 @@
         <w:pBdr>
           <w:bottom w:val="single" w:color="D9D9D9" w:sz="4" w:space="2"/>
         </w:pBdr>
-        <w:spacing w:after="24" w:before="92"/>
+        <w:spacing w:after="22" w:before="88"/>
       </w:pPr>
       <w:r>
         <w:rPr>
@@ -576,7 +576,7 @@
           <w:sz w:val="21"/>
           <w:szCs w:val="21"/>
         </w:rPr>
-        <w:t xml:space="preserve">Why our own systems can’t see it — the vendor blind spot</w:t>
+        <w:t xml:space="preserve">Why our own systems can’t see it: the vendor blind spot</w:t>
       </w:r>
     </w:p>
     <w:p>
@@ -589,7 +589,7 @@
           <w:sz w:val="18"/>
           <w:szCs w:val="18"/>
         </w:rPr>
-        <w:t xml:space="preserve">Our internal systems serve the distributor operating model. Owned Brands operates as a vendor inside a distributor and needs the lens those systems weren’t built to provide.</w:t>
+        <w:t xml:space="preserve">Our internal systems serve the distributor operating model. Owned Brands operates as a vendor inside a distributor and needs the lens those systems weren’t built to provide. The WCO seller is effectively our customer, yet engagement with a WCO seller isn’t tracked in USD.</w:t>
       </w:r>
     </w:p>
     <w:p>
@@ -597,7 +597,7 @@
         <w:pBdr>
           <w:bottom w:val="single" w:color="D9D9D9" w:sz="4" w:space="2"/>
         </w:pBdr>
-        <w:spacing w:after="24" w:before="92"/>
+        <w:spacing w:after="22" w:before="88"/>
       </w:pPr>
       <w:r>
         <w:rPr>
@@ -608,7 +608,7 @@
           <w:sz w:val="21"/>
           <w:szCs w:val="21"/>
         </w:rPr>
-        <w:t xml:space="preserve">How it works — two tiers, one spine</w:t>
+        <w:t xml:space="preserve">How it works: two tiers, one spine</w:t>
       </w:r>
     </w:p>
     <w:p>
@@ -716,7 +716,7 @@
           <w:sz w:val="18"/>
           <w:szCs w:val="18"/>
         </w:rPr>
-        <w:t xml:space="preserve"> — in collaboration with the WCO seller.</w:t>
+        <w:t xml:space="preserve">, in collaboration with the WCO seller.</w:t>
       </w:r>
     </w:p>
     <w:p>
@@ -724,7 +724,7 @@
         <w:pBdr>
           <w:bottom w:val="single" w:color="D9D9D9" w:sz="4" w:space="2"/>
         </w:pBdr>
-        <w:spacing w:after="24" w:before="92"/>
+        <w:spacing w:after="22" w:before="88"/>
       </w:pPr>
       <w:r>
         <w:rPr>
@@ -765,9 +765,9 @@
               <w:right w:val="single" w:color="D9D9D9" w:sz="1"/>
             </w:tcBorders>
             <w:tcMar>
-              <w:top w:type="dxa" w:w="42"/>
+              <w:top w:type="dxa" w:w="40"/>
               <w:left w:type="dxa" w:w="110"/>
-              <w:bottom w:type="dxa" w:w="42"/>
+              <w:bottom w:type="dxa" w:w="40"/>
               <w:right w:type="dxa" w:w="110"/>
             </w:tcMar>
           </w:tcPr>
@@ -797,9 +797,9 @@
               <w:right w:val="single" w:color="D9D9D9" w:sz="1"/>
             </w:tcBorders>
             <w:tcMar>
-              <w:top w:type="dxa" w:w="42"/>
+              <w:top w:type="dxa" w:w="40"/>
               <w:left w:type="dxa" w:w="110"/>
-              <w:bottom w:type="dxa" w:w="42"/>
+              <w:bottom w:type="dxa" w:w="40"/>
               <w:right w:type="dxa" w:w="110"/>
             </w:tcMar>
           </w:tcPr>
@@ -813,7 +813,7 @@
                 <w:sz w:val="17"/>
                 <w:szCs w:val="17"/>
               </w:rPr>
-              <w:t xml:space="preserve">Competitor part → owned-brand mapping; living, searchable, AI-extracted from datasheets.</w:t>
+              <w:t xml:space="preserve">Competitor part → owned-brand mapping; living, searchable, AI-extracted from datasheets. For OB enablement, not org-wide access.</w:t>
             </w:r>
           </w:p>
         </w:tc>
@@ -830,9 +830,9 @@
             </w:tcBorders>
             <w:shd w:fill="F5F5F5" w:val="clear"/>
             <w:tcMar>
-              <w:top w:type="dxa" w:w="42"/>
+              <w:top w:type="dxa" w:w="40"/>
               <w:left w:type="dxa" w:w="110"/>
-              <w:bottom w:type="dxa" w:w="42"/>
+              <w:bottom w:type="dxa" w:w="40"/>
               <w:right w:type="dxa" w:w="110"/>
             </w:tcMar>
           </w:tcPr>
@@ -863,9 +863,9 @@
             </w:tcBorders>
             <w:shd w:fill="F5F5F5" w:val="clear"/>
             <w:tcMar>
-              <w:top w:type="dxa" w:w="42"/>
+              <w:top w:type="dxa" w:w="40"/>
               <w:left w:type="dxa" w:w="110"/>
-              <w:bottom w:type="dxa" w:w="42"/>
+              <w:bottom w:type="dxa" w:w="40"/>
               <w:right w:type="dxa" w:w="110"/>
             </w:tcMar>
           </w:tcPr>
@@ -879,7 +879,7 @@
                 <w:sz w:val="17"/>
                 <w:szCs w:val="17"/>
               </w:rPr>
-              <w:t xml:space="preserve">Where to show up — deals at risk and margin under pressure; pipeline-weighted demand forecast surfaces a stock signal.</w:t>
+              <w:t xml:space="preserve">Where to show up: deals at risk and margin under pressure; pipeline-weighted demand forecast surfaces a stock signal.</w:t>
             </w:r>
           </w:p>
         </w:tc>
@@ -895,9 +895,9 @@
               <w:right w:val="single" w:color="D9D9D9" w:sz="1"/>
             </w:tcBorders>
             <w:tcMar>
-              <w:top w:type="dxa" w:w="42"/>
+              <w:top w:type="dxa" w:w="40"/>
               <w:left w:type="dxa" w:w="110"/>
-              <w:bottom w:type="dxa" w:w="42"/>
+              <w:bottom w:type="dxa" w:w="40"/>
               <w:right w:type="dxa" w:w="110"/>
             </w:tcMar>
           </w:tcPr>
@@ -927,9 +927,9 @@
               <w:right w:val="single" w:color="D9D9D9" w:sz="1"/>
             </w:tcBorders>
             <w:tcMar>
-              <w:top w:type="dxa" w:w="42"/>
+              <w:top w:type="dxa" w:w="40"/>
               <w:left w:type="dxa" w:w="110"/>
-              <w:bottom w:type="dxa" w:w="42"/>
+              <w:bottom w:type="dxa" w:w="40"/>
               <w:right w:type="dxa" w:w="110"/>
             </w:tcMar>
           </w:tcPr>
@@ -943,7 +943,7 @@
                 <w:sz w:val="17"/>
                 <w:szCs w:val="17"/>
               </w:rPr>
-              <w:t xml:space="preserve">Opportunities, quotes-in-progress, calls, visits, demos, hardware evals — tracking OB engagement with WCO sellers and customers.</w:t>
+              <w:t xml:space="preserve">OB-generated opportunities, quotes, calls, visits, demos, hardware evals; tracks OB engagement with WCO sellers and customers (not captured in USD).</w:t>
             </w:r>
           </w:p>
         </w:tc>
@@ -960,9 +960,9 @@
             </w:tcBorders>
             <w:shd w:fill="F5F5F5" w:val="clear"/>
             <w:tcMar>
-              <w:top w:type="dxa" w:w="42"/>
+              <w:top w:type="dxa" w:w="40"/>
               <w:left w:type="dxa" w:w="110"/>
-              <w:bottom w:type="dxa" w:w="42"/>
+              <w:bottom w:type="dxa" w:w="40"/>
               <w:right w:type="dxa" w:w="110"/>
             </w:tcMar>
           </w:tcPr>
@@ -993,9 +993,9 @@
             </w:tcBorders>
             <w:shd w:fill="F5F5F5" w:val="clear"/>
             <w:tcMar>
-              <w:top w:type="dxa" w:w="42"/>
+              <w:top w:type="dxa" w:w="40"/>
               <w:left w:type="dxa" w:w="110"/>
-              <w:bottom w:type="dxa" w:w="42"/>
+              <w:bottom w:type="dxa" w:w="40"/>
               <w:right w:type="dxa" w:w="110"/>
             </w:tcMar>
           </w:tcPr>
@@ -1009,7 +1009,7 @@
                 <w:sz w:val="17"/>
                 <w:szCs w:val="17"/>
               </w:rPr>
-              <w:t xml:space="preserve">Email-drop ingestion to structured records; natural-language leadership dashboard; in-tenant only.</w:t>
+              <w:t xml:space="preserve">Email-drop to structured records; opportunity-loss tracking; product-development signals; natural-language leadership dashboard; in-tenant only.</w:t>
             </w:r>
           </w:p>
         </w:tc>
@@ -1020,7 +1020,7 @@
         <w:pBdr>
           <w:bottom w:val="single" w:color="D9D9D9" w:sz="4" w:space="2"/>
         </w:pBdr>
-        <w:spacing w:after="24" w:before="92"/>
+        <w:spacing w:after="22" w:before="88"/>
       </w:pPr>
       <w:r>
         <w:rPr>
@@ -1067,7 +1067,7 @@
           <w:sz w:val="18"/>
           <w:szCs w:val="18"/>
         </w:rPr>
-        <w:t xml:space="preserve">Identity &amp; access: Entra ID SSO, application RBAC, territory row-level security mirroring Power BI RLS — margin/cost confined to the authorized group.</w:t>
+        <w:t xml:space="preserve">Identity &amp; access: Entra ID SSO, application RBAC, territory row-level security mirroring Power BI RLS. Margin/cost confined to the authorized OB group.</w:t>
       </w:r>
     </w:p>
     <w:p>
@@ -1093,7 +1093,7 @@
         <w:pBdr>
           <w:bottom w:val="single" w:color="D9D9D9" w:sz="4" w:space="2"/>
         </w:pBdr>
-        <w:spacing w:after="24" w:before="92"/>
+        <w:spacing w:after="22" w:before="88"/>
       </w:pPr>
       <w:r>
         <w:rPr>
@@ -1104,7 +1104,7 @@
           <w:sz w:val="21"/>
           <w:szCs w:val="21"/>
         </w:rPr>
-        <w:t xml:space="preserve">Risk boundaries — what we are NOT doing</w:t>
+        <w:t xml:space="preserve">Risk boundaries: what we are NOT doing</w:t>
       </w:r>
     </w:p>
     <w:p>
@@ -1117,7 +1117,7 @@
           <w:sz w:val="18"/>
           <w:szCs w:val="18"/>
         </w:rPr>
-        <w:t xml:space="preserve">No write/update/delete to CORE, USD, or any system of record   ·   no direct production-DB connectivity   ·   no duplication or ownership of WCO data   ·   no egress outside the Microsoft / Azure boundary.</w:t>
+        <w:t xml:space="preserve">No write/update/delete to CORE, USD, or any system of record   ·   no direct production-DB connectivity   ·   no duplication or ownership of WCO data   ·   no access outside the OB sales team   ·   no egress outside the Microsoft / Azure boundary.</w:t>
       </w:r>
     </w:p>
     <w:p>
@@ -1125,7 +1125,7 @@
         <w:pBdr>
           <w:bottom w:val="single" w:color="D9D9D9" w:sz="4" w:space="2"/>
         </w:pBdr>
-        <w:spacing w:after="24" w:before="92"/>
+        <w:spacing w:after="22" w:before="88"/>
       </w:pPr>
       <w:r>
         <w:rPr>
@@ -1166,9 +1166,9 @@
               <w:right w:val="single" w:color="D9D9D9" w:sz="1"/>
             </w:tcBorders>
             <w:tcMar>
-              <w:top w:type="dxa" w:w="42"/>
+              <w:top w:type="dxa" w:w="40"/>
               <w:left w:type="dxa" w:w="110"/>
-              <w:bottom w:type="dxa" w:w="42"/>
+              <w:bottom w:type="dxa" w:w="40"/>
               <w:right w:type="dxa" w:w="110"/>
             </w:tcMar>
           </w:tcPr>
@@ -1184,7 +1184,7 @@
                 <w:sz w:val="17"/>
                 <w:szCs w:val="17"/>
               </w:rPr>
-              <w:t xml:space="preserve">Phase 0 — now</w:t>
+              <w:t xml:space="preserve">Phase 0 (now)</w:t>
             </w:r>
           </w:p>
         </w:tc>
@@ -1198,9 +1198,9 @@
               <w:right w:val="single" w:color="D9D9D9" w:sz="1"/>
             </w:tcBorders>
             <w:tcMar>
-              <w:top w:type="dxa" w:w="42"/>
+              <w:top w:type="dxa" w:w="40"/>
               <w:left w:type="dxa" w:w="110"/>
-              <w:bottom w:type="dxa" w:w="42"/>
+              <w:bottom w:type="dxa" w:w="40"/>
               <w:right w:type="dxa" w:w="110"/>
             </w:tcMar>
           </w:tcPr>
@@ -1231,9 +1231,9 @@
             </w:tcBorders>
             <w:shd w:fill="F5F5F5" w:val="clear"/>
             <w:tcMar>
-              <w:top w:type="dxa" w:w="42"/>
+              <w:top w:type="dxa" w:w="40"/>
               <w:left w:type="dxa" w:w="110"/>
-              <w:bottom w:type="dxa" w:w="42"/>
+              <w:bottom w:type="dxa" w:w="40"/>
               <w:right w:type="dxa" w:w="110"/>
             </w:tcMar>
           </w:tcPr>
@@ -1264,9 +1264,9 @@
             </w:tcBorders>
             <w:shd w:fill="F5F5F5" w:val="clear"/>
             <w:tcMar>
-              <w:top w:type="dxa" w:w="42"/>
+              <w:top w:type="dxa" w:w="40"/>
               <w:left w:type="dxa" w:w="110"/>
-              <w:bottom w:type="dxa" w:w="42"/>
+              <w:bottom w:type="dxa" w:w="40"/>
               <w:right w:type="dxa" w:w="110"/>
             </w:tcMar>
           </w:tcPr>
@@ -1296,9 +1296,9 @@
               <w:right w:val="single" w:color="D9D9D9" w:sz="1"/>
             </w:tcBorders>
             <w:tcMar>
-              <w:top w:type="dxa" w:w="42"/>
+              <w:top w:type="dxa" w:w="40"/>
               <w:left w:type="dxa" w:w="110"/>
-              <w:bottom w:type="dxa" w:w="42"/>
+              <w:bottom w:type="dxa" w:w="40"/>
               <w:right w:type="dxa" w:w="110"/>
             </w:tcMar>
           </w:tcPr>
@@ -1328,9 +1328,9 @@
               <w:right w:val="single" w:color="D9D9D9" w:sz="1"/>
             </w:tcBorders>
             <w:tcMar>
-              <w:top w:type="dxa" w:w="42"/>
+              <w:top w:type="dxa" w:w="40"/>
               <w:left w:type="dxa" w:w="110"/>
-              <w:bottom w:type="dxa" w:w="42"/>
+              <w:bottom w:type="dxa" w:w="40"/>
               <w:right w:type="dxa" w:w="110"/>
             </w:tcMar>
           </w:tcPr>
@@ -1344,7 +1344,7 @@
                 <w:sz w:val="17"/>
                 <w:szCs w:val="17"/>
               </w:rPr>
-              <w:t xml:space="preserve">Build production on Azure — data-access layer, app DB, identity, embedded Power BI.</w:t>
+              <w:t xml:space="preserve">Build production on Azure: data-access layer, app DB, identity, embedded Power BI.</w:t>
             </w:r>
           </w:p>
         </w:tc>
@@ -1361,9 +1361,9 @@
             </w:tcBorders>
             <w:shd w:fill="F5F5F5" w:val="clear"/>
             <w:tcMar>
-              <w:top w:type="dxa" w:w="42"/>
+              <w:top w:type="dxa" w:w="40"/>
               <w:left w:type="dxa" w:w="110"/>
-              <w:bottom w:type="dxa" w:w="42"/>
+              <w:bottom w:type="dxa" w:w="40"/>
               <w:right w:type="dxa" w:w="110"/>
             </w:tcMar>
           </w:tcPr>
@@ -1394,9 +1394,9 @@
             </w:tcBorders>
             <w:shd w:fill="F5F5F5" w:val="clear"/>
             <w:tcMar>
-              <w:top w:type="dxa" w:w="42"/>
+              <w:top w:type="dxa" w:w="40"/>
               <w:left w:type="dxa" w:w="110"/>
-              <w:bottom w:type="dxa" w:w="42"/>
+              <w:bottom w:type="dxa" w:w="40"/>
               <w:right w:type="dxa" w:w="110"/>
             </w:tcMar>
           </w:tcPr>
@@ -1421,7 +1421,7 @@
         <w:pBdr>
           <w:bottom w:val="single" w:color="D9D9D9" w:sz="4" w:space="2"/>
         </w:pBdr>
-        <w:spacing w:after="24" w:before="92"/>
+        <w:spacing w:after="22" w:before="88"/>
       </w:pPr>
       <w:r>
         <w:rPr>
@@ -1452,15 +1452,15 @@
           <w:sz w:val="18"/>
           <w:szCs w:val="18"/>
         </w:rPr>
-        <w:t xml:space="preserve">Read-only data access — </w:t>
-      </w:r>
-      <w:r>
-        <w:rPr>
-          <w:rFonts w:ascii="Arial" w:cs="Arial" w:eastAsia="Arial" w:hAnsi="Arial"/>
-          <w:sz w:val="18"/>
-          <w:szCs w:val="18"/>
-        </w:rPr>
-        <w:t xml:space="preserve">via governed datasets, certified Power BI, or the API layer: sales incl. margin/cost, open orders &amp; backlog, quotes/bids, account/contact/SKU master, inventory. Defined user group: the Owned Brands sales team.</w:t>
+        <w:t xml:space="preserve">Read-only data access: </w:t>
+      </w:r>
+      <w:r>
+        <w:rPr>
+          <w:rFonts w:ascii="Arial" w:cs="Arial" w:eastAsia="Arial" w:hAnsi="Arial"/>
+          <w:sz w:val="18"/>
+          <w:szCs w:val="18"/>
+        </w:rPr>
+        <w:t xml:space="preserve">via governed datasets, certified Power BI, or the API layer (sales incl. margin/cost, open orders &amp; backlog, quotes/bids, account/contact/SKU master, inventory). Defined user group: the Owned Brands sales team only, with no access outside OB.</w:t>
       </w:r>
     </w:p>
     <w:p>
@@ -1480,7 +1480,7 @@
           <w:sz w:val="18"/>
           <w:szCs w:val="18"/>
         </w:rPr>
-        <w:t xml:space="preserve">Azure environment — </w:t>
+        <w:t xml:space="preserve">Azure environment: </w:t>
       </w:r>
       <w:r>
         <w:rPr>
@@ -1508,7 +1508,7 @@
           <w:sz w:val="18"/>
           <w:szCs w:val="18"/>
         </w:rPr>
-        <w:t xml:space="preserve">Governance liaisons — </w:t>
+        <w:t xml:space="preserve">Governance liaisons: </w:t>
       </w:r>
       <w:r>
         <w:rPr>
@@ -1536,15 +1536,15 @@
           <w:sz w:val="18"/>
           <w:szCs w:val="18"/>
         </w:rPr>
-        <w:t xml:space="preserve">Developer tooling &amp; hardware — </w:t>
-      </w:r>
-      <w:r>
-        <w:rPr>
-          <w:rFonts w:ascii="Arial" w:cs="Arial" w:eastAsia="Arial" w:hAnsi="Arial"/>
-          <w:sz w:val="18"/>
-          <w:szCs w:val="18"/>
-        </w:rPr>
-        <w:t xml:space="preserve">one MacBook Pro (or equivalent) as the primary dev workstation; standard dev licensing; incremental Azure consumption budget for the build phase, est. [confirm]/month during Phases 2–4.</w:t>
+        <w:t xml:space="preserve">Developer tooling &amp; hardware: </w:t>
+      </w:r>
+      <w:r>
+        <w:rPr>
+          <w:rFonts w:ascii="Arial" w:cs="Arial" w:eastAsia="Arial" w:hAnsi="Arial"/>
+          <w:sz w:val="18"/>
+          <w:szCs w:val="18"/>
+        </w:rPr>
+        <w:t xml:space="preserve">one MacBook Pro (or equivalent) as the primary dev workstation; standard dev licensing; incremental Azure consumption budget for the build phase, TBD with Cloud Engineering.</w:t>
       </w:r>
     </w:p>
     <w:p>
@@ -1560,7 +1560,7 @@
           <w:sz w:val="16"/>
           <w:szCs w:val="16"/>
         </w:rPr>
-        <w:t xml:space="preserve">Execution is solo — I build and operate the platform as the sole developer; no additional headcount requested.</w:t>
+        <w:t xml:space="preserve">Execution is solo: I build and operate the platform as the sole developer; no additional headcount requested.</w:t>
       </w:r>
     </w:p>
     <w:sectPr>
@@ -1628,7 +1628,7 @@
         <w:sz w:val="14"/>
         <w:szCs w:val="14"/>
       </w:rPr>
-      <w:t xml:space="preserve">Owned Brands Datavers Brief · Confidential — Internal · </w:t>
+      <w:t xml:space="preserve">Owned Brands Datavers Brief · Confidential / Internal · </w:t>
     </w:r>
     <w:r>
       <w:rPr>

</xml_diff>

<commit_message>
docs: add dashboard to one-pager; propagate page-1 edits to deck and page 2
</commit_message>
<xml_diff>
--- a/Board pitch/Owned_Brands_Board_Brief.docx
+++ b/Board pitch/Owned_Brands_Board_Brief.docx
@@ -157,7 +157,7 @@
           <w:sz w:val="18"/>
           <w:szCs w:val="18"/>
         </w:rPr>
-        <w:t xml:space="preserve">WCO’s systems (CORE, our ERP; USD, our CRM) are built for the distributor, not the vendor lens. Tools built specifically for OB will lift win rate and margin organization-wide.</w:t>
+        <w:t xml:space="preserve">WCO’s systems (CORE, USD) are built for the distributor, not the vendor lens. Tools built specifically for OB will lift win rate and margin organization-wide.</w:t>
       </w:r>
     </w:p>
     <w:p>
@@ -296,7 +296,7 @@
                 <w:sz w:val="16"/>
                 <w:szCs w:val="16"/>
               </w:rPr>
-              <w:t xml:space="preserve">Reach the right WCO seller / customer</w:t>
+              <w:t xml:space="preserve">Reach the right WCO seller / customer, at the right time</w:t>
             </w:r>
           </w:p>
         </w:tc>
@@ -434,19 +434,6 @@
     </w:tbl>
     <w:p>
       <w:pPr>
-        <w:spacing w:after="0" w:before="36"/>
-      </w:pPr>
-      <w:r>
-        <w:rPr>
-          <w:rFonts w:ascii="Arial" w:cs="Arial" w:eastAsia="Arial" w:hAnsi="Arial"/>
-          <w:sz w:val="18"/>
-          <w:szCs w:val="18"/>
-        </w:rPr>
-        <w:t xml:space="preserve">A read-only, vendor-side intelligence and activity platform inside WCO surfaces the signals and tracks our engagement, so we show up at the right time with the right pitch.</w:t>
-      </w:r>
-    </w:p>
-    <w:p>
-      <w:pPr>
         <w:spacing w:after="36" w:before="140"/>
       </w:pPr>
       <w:r>
@@ -485,10 +472,10 @@
       <w:r>
         <w:rPr>
           <w:rFonts w:ascii="Arial" w:cs="Arial" w:eastAsia="Arial" w:hAnsi="Arial"/>
-          <w:sz w:val="17"/>
-          <w:szCs w:val="17"/>
-        </w:rPr>
-        <w:t xml:space="preserve">A WCO seller is bidding a security project (a national-brand camera line, with the rest of the bill of materials still open) and holds registered project pricing on the cameras. A competing distributor bids the same cameras but pairs them with its own-brand cable; the extra margin on that cable lets it beat our total price, registered pricing and all. </w:t>
+          <w:sz w:val="16"/>
+          <w:szCs w:val="16"/>
+        </w:rPr>
+        <w:t xml:space="preserve">A WCO seller is bidding a security project (national-brand cameras, the rest of the BoM still open) with registered project pricing. A competing distributor bids the same cameras but pairs them with its own-brand cable; the extra cable margin lets it beat our total price. </w:t>
       </w:r>
       <w:r>
         <w:rPr>
@@ -496,10 +483,10 @@
           <w:b/>
           <w:bCs/>
           <w:color w:val="1B7F4B"/>
-          <w:sz w:val="17"/>
-          <w:szCs w:val="17"/>
-        </w:rPr>
-        <w:t xml:space="preserve">The platform flags this seller, and the OB team helps them specify Owned Brands into the bill of materials, lifting margin and sharpening total price so WCO keeps the deal.</w:t>
+          <w:sz w:val="16"/>
+          <w:szCs w:val="16"/>
+        </w:rPr>
+        <w:t xml:space="preserve">The platform flags this seller, and OB helps specify Owned Brands into the BoM, lifting margin and total price so WCO keeps the deal.</w:t>
       </w:r>
     </w:p>
     <w:p>
@@ -542,10 +529,10 @@
       <w:r>
         <w:rPr>
           <w:rFonts w:ascii="Arial" w:cs="Arial" w:eastAsia="Arial" w:hAnsi="Arial"/>
-          <w:sz w:val="17"/>
-          <w:szCs w:val="17"/>
-        </w:rPr>
-        <w:t xml:space="preserve">The Owned Brands team has just integrated the LCO sales organization, adding capability and aligning structure to its mandate inside WCO. The team is built to execute; the missing piece is the toolset that lets it act. Equip it now and that structural investment compounds; wait, and winnable deals like the one above keep slipping. </w:t>
+          <w:sz w:val="16"/>
+          <w:szCs w:val="16"/>
+        </w:rPr>
+        <w:t xml:space="preserve">We just integrated the LCO sales organization, adding capability and aligning structure to OB’s mandate inside WCO. The team is built to execute; the missing piece is the toolset that lets it see around corners that are blind today. </w:t>
       </w:r>
       <w:r>
         <w:rPr>
@@ -553,8 +540,8 @@
           <w:b/>
           <w:bCs/>
           <w:color w:val="1B7F4B"/>
-          <w:sz w:val="17"/>
-          <w:szCs w:val="17"/>
+          <w:sz w:val="16"/>
+          <w:szCs w:val="16"/>
         </w:rPr>
         <w:t xml:space="preserve">First-90-day target: identify and support 30 opportunities WCO would otherwise have lost.</w:t>
       </w:r>
@@ -562,7 +549,7 @@
     <w:p>
       <w:pPr>
         <w:shd w:fill="1B7F4B" w:val="clear"/>
-        <w:spacing w:after="0" w:before="90"/>
+        <w:spacing w:after="0" w:before="70"/>
       </w:pPr>
       <w:r>
         <w:rPr>
@@ -582,7 +569,87 @@
           <w:sz w:val="18"/>
           <w:szCs w:val="18"/>
         </w:rPr>
-        <w:t xml:space="preserve">Approve read-only access to governed WCO sales data (incl. margin/cost) for the Owned Brands sales team only, with no access outside OB. Provision the Azure build environment and assign governance liaisons. Tooling and budget detail overleaf.</w:t>
+        <w:t xml:space="preserve">Approve read-only access to governed WCO sales data (incl. margin/cost) for the Owned Brands sales team only. No access provided outside of OB. Provision the Azure build environment and assign governance liaisons. Tooling and budget detail overleaf.</w:t>
+      </w:r>
+    </w:p>
+    <w:p>
+      <w:pPr>
+        <w:spacing w:after="30" w:before="70"/>
+      </w:pPr>
+      <w:r>
+        <w:rPr>
+          <w:rFonts w:ascii="Arial" w:cs="Arial" w:eastAsia="Arial" w:hAnsi="Arial"/>
+          <w:b/>
+          <w:bCs/>
+          <w:color w:val="1B7F4B"/>
+          <w:spacing w:val="18"/>
+          <w:sz w:val="16"/>
+          <w:szCs w:val="16"/>
+        </w:rPr>
+        <w:t xml:space="preserve">ALREADY BUILT</w:t>
+      </w:r>
+      <w:r>
+        <w:rPr>
+          <w:rFonts w:ascii="Arial" w:cs="Arial" w:eastAsia="Arial" w:hAnsi="Arial"/>
+          <w:i/>
+          <w:iCs/>
+          <w:color w:val="5A5A5A"/>
+          <w:sz w:val="14"/>
+          <w:szCs w:val="14"/>
+        </w:rPr>
+        <w:t xml:space="preserve">    Working two-persona wireframe (Leadership + Sales Team); sample data only. Proven UX, not a concept.</w:t>
+      </w:r>
+    </w:p>
+    <w:p>
+      <w:pPr>
+        <w:pBdr>
+          <w:top w:val="single" w:color="D9D9D9" w:sz="4" w:space="2"/>
+          <w:bottom w:val="single" w:color="D9D9D9" w:sz="4" w:space="2"/>
+          <w:left w:val="single" w:color="D9D9D9" w:sz="4" w:space="2"/>
+          <w:right w:val="single" w:color="D9D9D9" w:sz="4" w:space="2"/>
+        </w:pBdr>
+        <w:spacing w:after="0" w:before="0"/>
+        <w:jc w:val="center"/>
+      </w:pPr>
+      <w:r>
+        <w:drawing>
+          <wp:inline distT="0" distB="0" distL="0" distR="0">
+            <wp:extent cx="4762500" cy="3305175"/>
+            <wp:effectExtent t="0" r="0" b="0" l="0"/>
+            <wp:docPr id="1" name="dashboard" descr="Working wireframe of the Owned Brands leadership dashboard" title="Leadership dashboard"/>
+            <wp:cNvGraphicFramePr>
+              <a:graphicFrameLocks xmlns:a="http://schemas.openxmlformats.org/drawingml/2006/main" noChangeAspect="1"/>
+            </wp:cNvGraphicFramePr>
+            <a:graphic xmlns:a="http://schemas.openxmlformats.org/drawingml/2006/main">
+              <a:graphicData uri="http://schemas.openxmlformats.org/drawingml/2006/picture">
+                <pic:pic xmlns:pic="http://schemas.openxmlformats.org/drawingml/2006/picture">
+                  <pic:nvPicPr>
+                    <pic:cNvPr id="0" name="" descr=""/>
+                    <pic:cNvPicPr>
+                      <a:picLocks noChangeAspect="1" noChangeArrowheads="1"/>
+                    </pic:cNvPicPr>
+                  </pic:nvPicPr>
+                  <pic:blipFill>
+                    <a:blip r:embed="rId8" cstate="none"/>
+                    <a:srcRect/>
+                    <a:stretch>
+                      <a:fillRect/>
+                    </a:stretch>
+                  </pic:blipFill>
+                  <pic:spPr bwMode="auto">
+                    <a:xfrm>
+                      <a:off x="0" y="0"/>
+                      <a:ext cx="4762500" cy="3305175"/>
+                    </a:xfrm>
+                    <a:prstGeom prst="rect">
+                      <a:avLst/>
+                    </a:prstGeom>
+                  </pic:spPr>
+                </pic:pic>
+              </a:graphicData>
+            </a:graphic>
+          </wp:inline>
+        </w:drawing>
       </w:r>
     </w:p>
     <w:p>
@@ -1567,7 +1634,7 @@
           <w:sz w:val="18"/>
           <w:szCs w:val="18"/>
         </w:rPr>
-        <w:t xml:space="preserve">via governed datasets, certified Power BI, or the API layer (sales incl. margin/cost, open orders &amp; backlog, quotes/bids, account/contact/SKU master, inventory). Defined user group: the Owned Brands sales team only, with no access outside OB.</w:t>
+        <w:t xml:space="preserve">via governed datasets, certified Power BI, or the API layer (sales incl. margin/cost, open orders &amp; backlog, quotes/bids, account/contact/SKU master, inventory). Defined user group: the Owned Brands sales team only. No access provided outside of OB.</w:t>
       </w:r>
     </w:p>
     <w:p>

</xml_diff>

<commit_message>
docs: update margin metric to 39.4%; formalize narrative; primary-customer reframe; add Claude Code sandbox ask
</commit_message>
<xml_diff>
--- a/Board pitch/Owned_Brands_Board_Brief.docx
+++ b/Board pitch/Owned_Brands_Board_Brief.docx
@@ -718,7 +718,7 @@
           <w:sz w:val="18"/>
           <w:szCs w:val="18"/>
         </w:rPr>
-        <w:t xml:space="preserve">The Owned Brands team doesn’t currently receive the signals that identify sellers who need help winning deals they’d otherwise lose, or who are losing margin to competitive pressure or a lack of national-brand support. We can’t be the best version of the resource we’re meant to be without better visibility into the data.</w:t>
+        <w:t xml:space="preserve">The Owned Brands team does not receive the signals that would flag sellers at risk of losing a winnable deal, or accounts losing margin to competitive pressure or a lack of national-brand support. With real-time insight into sales activity, we can calibrate our efforts to help WCO sellers win and grow margin.</w:t>
       </w:r>
     </w:p>
     <w:p>
@@ -731,7 +731,7 @@
           <w:sz w:val="18"/>
           <w:szCs w:val="18"/>
         </w:rPr>
-        <w:t xml:space="preserve">We are WCO’s owned-brands vendor team, and our job is to call on WCO sellers and WCO customers. The better our data, the better we identify the signals that put us in the right place at the right time, and the more we lift win rate and margin organization-wide.</w:t>
+        <w:t xml:space="preserve">As WCO’s owned-brands vendor team, our mandate is to call on WCO sellers and customers. Better data sharpens the signals that put us in the right place at the right time, lifting win rate and margin across the organization.</w:t>
       </w:r>
     </w:p>
     <w:p>
@@ -763,7 +763,7 @@
           <w:sz w:val="18"/>
           <w:szCs w:val="18"/>
         </w:rPr>
-        <w:t xml:space="preserve">Our internal systems serve the distributor operating model. Owned Brands operates as a vendor inside a distributor and needs the lens those systems weren’t built to provide. The WCO seller is effectively our customer, yet engagement with a WCO seller isn’t tracked in USD.</w:t>
+        <w:t xml:space="preserve">Our internal systems serve the distributor operating model. Owned Brands operates as a vendor inside a distributor, and the distributor is our primary customer. We need a distinct view of the data to maximize our value. The WCO seller is effectively our customer, yet engagement with a WCO seller is not tracked in USD.</w:t>
       </w:r>
     </w:p>
     <w:p>
@@ -1718,7 +1718,7 @@
           <w:sz w:val="18"/>
           <w:szCs w:val="18"/>
         </w:rPr>
-        <w:t xml:space="preserve">one MacBook Pro (or equivalent) as the primary dev workstation; standard dev licensing; incremental Azure consumption budget for the build phase, TBD with Cloud Engineering.</w:t>
+        <w:t xml:space="preserve">one MacBook Pro (or equivalent) as the primary dev workstation; sandbox access to Claude Code; standard dev licensing; incremental Azure consumption budget for the build phase, TBD with Cloud Engineering.</w:t>
       </w:r>
     </w:p>
     <w:p>

</xml_diff>